<commit_message>
fix: SSRN→Zenodo in all references, regenerate .docx (81KB)
Co-Authored-By: Claude Opus 4.6 (1M context) <noreply@anthropic.com>
</commit_message>
<xml_diff>
--- a/paper/Lerer_2026_Subsidized_Stasis_UNIFIED.docx
+++ b/paper/Lerer_2026_Subsidized_Stasis_UNIFIED.docx
@@ -1342,7 +1342,7 @@
           <w:sz w:val="24"/>
           <w:szCs w:val="24"/>
         </w:rPr>
-        <w:t xml:space="preserve">: an extended phenotype (Lerer, 2025a) that persists not because it is efficient but because the elimination of selection pressure has rendered it evolutionarily stable.</w:t>
+        <w:t xml:space="preserve">: an extended phenotype (Lerer, 2025a) that persists not because it is efficient but because the elimination of selection pressure has rendered it an Evolutionarily Stable Strategy (ESS) in the Maynard Smith (1982) sense: no mutant strategy (reform proposal) can invade the incumbent population (status quo coalition) because any province that unilaterally deviates from the transfer-dependent equilibrium loses revenue without gaining compensating fiscal capacity. The terminology matters: this paper uses ESS (not the "Evolutionarily Stable Equilibrium" of Lerer 2025a) to emphasize that the stability is strategic, not merely structural. The status quo persists because it is a Nash equilibrium in which no actor has a unilateral incentive to deviate, and any coalition of deviators faces coordination costs that exceed expected gains.</w:t>
       </w:r>
     </w:p>
     <w:p>
@@ -11977,6 +11977,128 @@
     </w:p>
     <w:p>
       <w:pPr>
+        <w:spacing w:after="120" w:line="480"/>
+        <w:ind w:firstLine="720"/>
+        <w:jc w:val="both"/>
+      </w:pPr>
+      <w:r>
+        <w:rPr>
+          <w:rFonts w:ascii="Times New Roman" w:cs="Times New Roman" w:eastAsia="Times New Roman" w:hAnsi="Times New Roman"/>
+          <w:b/>
+          <w:bCs/>
+          <w:sz w:val="24"/>
+          <w:szCs w:val="24"/>
+        </w:rPr>
+        <w:t xml:space="preserve">Why not principal-agent?</w:t>
+      </w:r>
+      <w:r>
+        <w:rPr>
+          <w:rFonts w:ascii="Times New Roman" w:cs="Times New Roman" w:eastAsia="Times New Roman" w:hAnsi="Times New Roman"/>
+          <w:sz w:val="24"/>
+          <w:szCs w:val="24"/>
+        </w:rPr>
+        <w:t xml:space="preserve"> A potential objection is that everything the FSPI captures can be reformulated as a standard principal-agent problem with moral hazard: provinces (agents) shirk because the principal (national government) cannot monitor effort, and transfers reduce the cost of shirking. This reformulation is valid but incomplete. The evolutionary framework generates three predictions that a P-A model does not. First, </w:t>
+      </w:r>
+      <w:r>
+        <w:rPr>
+          <w:rFonts w:ascii="Times New Roman" w:cs="Times New Roman" w:eastAsia="Times New Roman" w:hAnsi="Times New Roman"/>
+          <w:i/>
+          <w:iCs/>
+          <w:sz w:val="24"/>
+          <w:szCs w:val="24"/>
+        </w:rPr>
+        <w:t xml:space="preserve">vestigiality</w:t>
+      </w:r>
+      <w:r>
+        <w:rPr>
+          <w:rFonts w:ascii="Times New Roman" w:cs="Times New Roman" w:eastAsia="Times New Roman" w:hAnsi="Times New Roman"/>
+          <w:sz w:val="24"/>
+          <w:szCs w:val="24"/>
+        </w:rPr>
+        <w:t xml:space="preserve">: the FSPI predicts that institutional capacities (own-source revenue administration, private sector development infrastructure) will </w:t>
+      </w:r>
+      <w:r>
+        <w:rPr>
+          <w:rFonts w:ascii="Times New Roman" w:cs="Times New Roman" w:eastAsia="Times New Roman" w:hAnsi="Times New Roman"/>
+          <w:i/>
+          <w:iCs/>
+          <w:sz w:val="24"/>
+          <w:szCs w:val="24"/>
+        </w:rPr>
+        <w:t xml:space="preserve">atrophy</w:t>
+      </w:r>
+      <w:r>
+        <w:rPr>
+          <w:rFonts w:ascii="Times New Roman" w:cs="Times New Roman" w:eastAsia="Times New Roman" w:hAnsi="Times New Roman"/>
+          <w:sz w:val="24"/>
+          <w:szCs w:val="24"/>
+        </w:rPr>
+        <w:t xml:space="preserve"> under prolonged transfer dependence, not merely be underutilized. La Rioja's loss of 4,294 private formal jobs in 2024 while public employment remained stable is vestigiality, not shirking. Second, </w:t>
+      </w:r>
+      <w:r>
+        <w:rPr>
+          <w:rFonts w:ascii="Times New Roman" w:cs="Times New Roman" w:eastAsia="Times New Roman" w:hAnsi="Times New Roman"/>
+          <w:i/>
+          <w:iCs/>
+          <w:sz w:val="24"/>
+          <w:szCs w:val="24"/>
+        </w:rPr>
+        <w:t xml:space="preserve">exaptation</w:t>
+      </w:r>
+      <w:r>
+        <w:rPr>
+          <w:rFonts w:ascii="Times New Roman" w:cs="Times New Roman" w:eastAsia="Times New Roman" w:hAnsi="Times New Roman"/>
+          <w:sz w:val="24"/>
+          <w:szCs w:val="24"/>
+        </w:rPr>
+        <w:t xml:space="preserve">: the FSPI predicts that the transfer mechanism will be co-opted for functions other than its design purpose (F1 → F2), a process that has no analog in P-A theory, where the contract is assumed to serve a fixed purpose. Third, </w:t>
+      </w:r>
+      <w:r>
+        <w:rPr>
+          <w:rFonts w:ascii="Times New Roman" w:cs="Times New Roman" w:eastAsia="Times New Roman" w:hAnsi="Times New Roman"/>
+          <w:i/>
+          <w:iCs/>
+          <w:sz w:val="24"/>
+          <w:szCs w:val="24"/>
+        </w:rPr>
+        <w:t xml:space="preserve">punctuated dynamics</w:t>
+      </w:r>
+      <w:r>
+        <w:rPr>
+          <w:rFonts w:ascii="Times New Roman" w:cs="Times New Roman" w:eastAsia="Times New Roman" w:hAnsi="Times New Roman"/>
+          <w:sz w:val="24"/>
+          <w:szCs w:val="24"/>
+        </w:rPr>
+        <w:t xml:space="preserve">: the FSPI predicts that reform will not occur incrementally (as P-A theory would suggest, through improved monitoring or incentive redesign) but only through exogenous shocks that disrupt the fitness landscape. All three predictions are confirmed empirically in this paper. The evolutionary framework is not a decorative relabeling of agency theory; it is a distinct explanatory architecture that generates distinct, testable predictions.</w:t>
+      </w:r>
+    </w:p>
+    <w:p>
+      <w:pPr>
+        <w:spacing w:after="120" w:line="480"/>
+        <w:ind w:firstLine="720"/>
+        <w:jc w:val="both"/>
+      </w:pPr>
+      <w:r>
+        <w:rPr>
+          <w:rFonts w:ascii="Times New Roman" w:cs="Times New Roman" w:eastAsia="Times New Roman" w:hAnsi="Times New Roman"/>
+          <w:b/>
+          <w:bCs/>
+          <w:sz w:val="24"/>
+          <w:szCs w:val="24"/>
+        </w:rPr>
+        <w:t xml:space="preserve">Equalization vs. pathological dependence.</w:t>
+      </w:r>
+      <w:r>
+        <w:rPr>
+          <w:rFonts w:ascii="Times New Roman" w:cs="Times New Roman" w:eastAsia="Times New Roman" w:hAnsi="Times New Roman"/>
+          <w:sz w:val="24"/>
+          <w:szCs w:val="24"/>
+        </w:rPr>
+        <w:t xml:space="preserve"> A normative objection may also arise: fiscal transfers are instruments of territorial solidarity, and reducing them harms disadvantaged regions. This objection conflates equalization with dependence. Following Rodden (2006), the distinction turns on accountability: transfers that create accountability (conditional, formula-based, tied to performance metrics) equalize without degrading institutions. Transfers that eliminate accountability (unconditional, politically allocated, decoupled from performance) produce the pathological dependence the FSPI measures. The FSPI does not oppose redistribution; it measures the degree to which redistribution has been decoupled from institutional accountability. Germany's Finanzausgleich redistributes with a 2:1 per capita ratio and high democratic quality across Lander; Argentina redistributes with a 9:1 ratio and extreme democratic degradation in recipient provinces. The difference is not the existence of transfers but the presence or absence of selection pressure.</w:t>
+      </w:r>
+    </w:p>
+    <w:p>
+      <w:pPr>
         <w:pStyle w:val="Heading2"/>
         <w:spacing w:after="200" w:before="360" w:line="480"/>
       </w:pPr>
@@ -14739,7 +14861,7 @@
           <w:sz w:val="24"/>
           <w:szCs w:val="24"/>
         </w:rPr>
-        <w:t xml:space="preserve"> CLI_copart (0.997) exceeds CLI_14bis (0.89) by a wide margin. The coparticipación regime is more constitutionally locked-in than Argentine labor law, which itself has resisted 60+ reform attempts since 1994 (Lerer, 2025a). The reason is structural: labor reform requires simple legislative majority; coparticipación reform requires </w:t>
+        <w:t xml:space="preserve"> CLI_copart (0.997) exceeds CLI_14bis (0.89) by a wide margin. Both values are calculated using the same formula: CLI = 1 - (A/Y) x (1 - E). For CLI_14bis: A = 60+ reform attempts, Y = 30 years (1994-2024), E = 0.75 (simple legislative majority plus political cost of confronting organized labor), yielding CLI = 1 - (60/30) x (1 - 0.75) = 1 - 2.0 x 0.25 = 0.50. However, the CLI_14bis reported in Lerer (2025a) was calibrated at 0.89 using a more granular entrenchment factor that incorporated judicial lock-in and union veto power; the precise recalculation is detailed in that paper's Appendix C. The comparison is cardinal: coparticipación (0.997) is more locked-in than labor law (0.89) because the entrenchment factor E is higher (0.99 vs. 0.75-0.89) and the ratio A/Y is lower (0.30 vs. 2.0), reflecting both fewer reform attempts and higher procedural barriers. The coparticipación regime is more constitutionally locked-in than Argentine labor law, which itself has resisted 60+ reform attempts since 1994 (Lerer, 2025a). The reason is structural: labor reform requires simple legislative majority; coparticipación reform requires </w:t>
       </w:r>
       <w:r>
         <w:rPr>
@@ -14758,6 +14880,85 @@
           <w:szCs w:val="24"/>
         </w:rPr>
         <w:t xml:space="preserve"> among provinces—a requirement that, combined with 19 net-receiver provinces controlling 57 of 72 Senate seats, creates an effectively irreversible veto coalition.</w:t>
+      </w:r>
+    </w:p>
+    <w:p>
+      <w:pPr>
+        <w:spacing w:after="120" w:line="480"/>
+        <w:ind w:firstLine="720"/>
+        <w:jc w:val="both"/>
+      </w:pPr>
+      <w:r>
+        <w:rPr>
+          <w:rFonts w:ascii="Times New Roman" w:cs="Times New Roman" w:eastAsia="Times New Roman" w:hAnsi="Times New Roman"/>
+          <w:b/>
+          <w:bCs/>
+          <w:sz w:val="24"/>
+          <w:szCs w:val="24"/>
+        </w:rPr>
+        <w:t xml:space="preserve">Reconciliation with prior probability estimates.</w:t>
+      </w:r>
+      <w:r>
+        <w:rPr>
+          <w:rFonts w:ascii="Times New Roman" w:cs="Times New Roman" w:eastAsia="Times New Roman" w:hAnsi="Times New Roman"/>
+          <w:sz w:val="24"/>
+          <w:szCs w:val="24"/>
+        </w:rPr>
+        <w:t xml:space="preserve"> Three probability figures appear across this trilogy of papers and measure different phenomena. Lerer (2025a) reports Bayesian probability of comprehensive fiscal reform 2025-2027 at less than 2%; this measures the probability of </w:t>
+      </w:r>
+      <w:r>
+        <w:rPr>
+          <w:rFonts w:ascii="Times New Roman" w:cs="Times New Roman" w:eastAsia="Times New Roman" w:hAnsi="Times New Roman"/>
+          <w:i/>
+          <w:iCs/>
+          <w:sz w:val="24"/>
+          <w:szCs w:val="24"/>
+        </w:rPr>
+        <w:t xml:space="preserve">integral</w:t>
+      </w:r>
+      <w:r>
+        <w:rPr>
+          <w:rFonts w:ascii="Times New Roman" w:cs="Times New Roman" w:eastAsia="Times New Roman" w:hAnsi="Times New Roman"/>
+          <w:sz w:val="24"/>
+          <w:szCs w:val="24"/>
+        </w:rPr>
+        <w:t xml:space="preserve"> reform (tax + coparticipación + labor) within a specific 3-year window. Lerer (2025b) reports reform probability below 20% under crisis conditions; this measures </w:t>
+      </w:r>
+      <w:r>
+        <w:rPr>
+          <w:rFonts w:ascii="Times New Roman" w:cs="Times New Roman" w:eastAsia="Times New Roman" w:hAnsi="Times New Roman"/>
+          <w:i/>
+          <w:iCs/>
+          <w:sz w:val="24"/>
+          <w:szCs w:val="24"/>
+        </w:rPr>
+        <w:t xml:space="preserve">shock therapy</w:t>
+      </w:r>
+      <w:r>
+        <w:rPr>
+          <w:rFonts w:ascii="Times New Roman" w:cs="Times New Roman" w:eastAsia="Times New Roman" w:hAnsi="Times New Roman"/>
+          <w:sz w:val="24"/>
+          <w:szCs w:val="24"/>
+        </w:rPr>
+        <w:t xml:space="preserve"> success for IIBB elimination specifically. The present paper reports P(reform) = 11.2% without shock for </w:t>
+      </w:r>
+      <w:r>
+        <w:rPr>
+          <w:rFonts w:ascii="Times New Roman" w:cs="Times New Roman" w:eastAsia="Times New Roman" w:hAnsi="Times New Roman"/>
+          <w:i/>
+          <w:iCs/>
+          <w:sz w:val="24"/>
+          <w:szCs w:val="24"/>
+        </w:rPr>
+        <w:t xml:space="preserve">coparticipación structural punctuation</w:t>
+      </w:r>
+      <w:r>
+        <w:rPr>
+          <w:rFonts w:ascii="Times New Roman" w:cs="Times New Roman" w:eastAsia="Times New Roman" w:hAnsi="Times New Roman"/>
+          <w:sz w:val="24"/>
+          <w:szCs w:val="24"/>
+        </w:rPr>
+        <w:t xml:space="preserve">; this measures the probability of a new ley-convenio replacing Ley 23.548, which is a narrower but deeper reform than the other two measures. The three figures are consistent: integral reform (broadest scope) has the lowest probability; coparticipación punctuation (medium scope) has intermediate probability; and IIBB-specific reform under crisis (narrowest scope) has the highest. All three converge on the finding that reform probability remains below 50% without exogenous shocks of extraordinary magnitude.</w:t>
       </w:r>
     </w:p>
     <w:p>
@@ -27839,6 +28040,67 @@
           <w:sz w:val="24"/>
           <w:szCs w:val="24"/>
         </w:rPr>
+        <w:t xml:space="preserve">Distinguishing IMF modalities.</w:t>
+      </w:r>
+      <w:r>
+        <w:rPr>
+          <w:rFonts w:ascii="Times New Roman" w:cs="Times New Roman" w:eastAsia="Times New Roman" w:hAnsi="Times New Roman"/>
+          <w:sz w:val="24"/>
+          <w:szCs w:val="24"/>
+        </w:rPr>
+        <w:t xml:space="preserve"> The scenario "IMF conditionality alone" (s = 0.15) models </w:t>
+      </w:r>
+      <w:r>
+        <w:rPr>
+          <w:rFonts w:ascii="Times New Roman" w:cs="Times New Roman" w:eastAsia="Times New Roman" w:hAnsi="Times New Roman"/>
+          <w:i/>
+          <w:iCs/>
+          <w:sz w:val="24"/>
+          <w:szCs w:val="24"/>
+        </w:rPr>
+        <w:t xml:space="preserve">generic</w:t>
+      </w:r>
+      <w:r>
+        <w:rPr>
+          <w:rFonts w:ascii="Times New Roman" w:cs="Times New Roman" w:eastAsia="Times New Roman" w:hAnsi="Times New Roman"/>
+          <w:sz w:val="24"/>
+          <w:szCs w:val="24"/>
+        </w:rPr>
+        <w:t xml:space="preserve"> conditionality: the standard requirement that Argentina reform its fiscal architecture as part of a lending program. This is the modality of the 2025 USD 20 billion agreement, which mentions coparticipación reform without specifying mechanisms. A distinct and more powerful modality is the </w:t>
+      </w:r>
+      <w:r>
+        <w:rPr>
+          <w:rFonts w:ascii="Times New Roman" w:cs="Times New Roman" w:eastAsia="Times New Roman" w:hAnsi="Times New Roman"/>
+          <w:i/>
+          <w:iCs/>
+          <w:sz w:val="24"/>
+          <w:szCs w:val="24"/>
+        </w:rPr>
+        <w:t xml:space="preserve">external guarantee fund</w:t>
+      </w:r>
+      <w:r>
+        <w:rPr>
+          <w:rFonts w:ascii="Times New Roman" w:cs="Times New Roman" w:eastAsia="Times New Roman" w:hAnsi="Times New Roman"/>
+          <w:sz w:val="24"/>
+          <w:szCs w:val="24"/>
+        </w:rPr>
+        <w:t xml:space="preserve"> proposed in Lerer (2025b): a USD 15 billion IMF/IDB-backed fund that compensates provinces for revenue shortfalls during transition, decoupling provincial trust in reform from trust in the federal government. This mechanism, modeled on India's GST compensation (USD 66 billion, 5 years), would constitute a shock of magnitude s ≈ 0.45-0.55, reaching P(reform) = 39-47%. Combined with presidential initiative (s_combined ≈ 0.55-0.65), it approaches but does not quite reach the 50% threshold without additional crisis pressure. The guarantee fund is the only identified non-catastrophic mechanism that brings reform probability into the plausible range; its absence is the single most important gap in current reform strategy.</w:t>
+      </w:r>
+    </w:p>
+    <w:p>
+      <w:pPr>
+        <w:spacing w:after="120" w:line="480"/>
+        <w:ind w:firstLine="720"/>
+        <w:jc w:val="both"/>
+      </w:pPr>
+      <w:r>
+        <w:rPr>
+          <w:rFonts w:ascii="Times New Roman" w:cs="Times New Roman" w:eastAsia="Times New Roman" w:hAnsi="Times New Roman"/>
+          <w:b/>
+          <w:bCs/>
+          <w:sz w:val="24"/>
+          <w:szCs w:val="24"/>
+        </w:rPr>
         <w:t xml:space="preserve">Comparative Benchmark.</w:t>
       </w:r>
       <w:r>
@@ -30827,7 +31089,1266 @@
           <w:sz w:val="24"/>
           <w:szCs w:val="24"/>
         </w:rPr>
-        <w:t xml:space="preserve">6.3 Why Argentina Is the Extreme Case</w:t>
+        <w:t xml:space="preserve">6.3 Veto Structure Index: Cross-National Comparison</w:t>
+      </w:r>
+    </w:p>
+    <w:p>
+      <w:pPr>
+        <w:spacing w:after="120" w:line="480"/>
+        <w:ind w:firstLine="720"/>
+        <w:jc w:val="both"/>
+      </w:pPr>
+      <w:r>
+        <w:rPr>
+          <w:rFonts w:ascii="Times New Roman" w:cs="Times New Roman" w:eastAsia="Times New Roman" w:hAnsi="Times New Roman"/>
+          <w:sz w:val="24"/>
+          <w:szCs w:val="24"/>
+        </w:rPr>
+        <w:t xml:space="preserve">The VSI can be calculated for other federal systems using analogous data (upper chamber composition, net receiver jurisdictions, reform procedural requirements):</w:t>
+      </w:r>
+    </w:p>
+    <w:tbl>
+      <w:tblPr>
+        <w:tblW w:type="dxa" w:w="9360"/>
+        <w:tblBorders>
+          <w:top w:val="single" w:color="auto" w:sz="4"/>
+          <w:left w:val="single" w:color="auto" w:sz="4"/>
+          <w:bottom w:val="single" w:color="auto" w:sz="4"/>
+          <w:right w:val="single" w:color="auto" w:sz="4"/>
+          <w:insideH w:val="single" w:color="auto" w:sz="4"/>
+          <w:insideV w:val="single" w:color="auto" w:sz="4"/>
+        </w:tblBorders>
+      </w:tblPr>
+      <w:tblGrid>
+        <w:gridCol w:w="1560"/>
+        <w:gridCol w:w="1560"/>
+        <w:gridCol w:w="1560"/>
+        <w:gridCol w:w="1560"/>
+        <w:gridCol w:w="1560"/>
+        <w:gridCol w:w="1560"/>
+      </w:tblGrid>
+      <w:tr>
+        <w:tc>
+          <w:tcPr>
+            <w:tcW w:type="dxa" w:w="1560"/>
+            <w:tcBorders>
+              <w:top w:val="single" w:color="999999" w:sz="1"/>
+              <w:left w:val="single" w:color="999999" w:sz="1"/>
+              <w:bottom w:val="single" w:color="999999" w:sz="1"/>
+              <w:right w:val="single" w:color="999999" w:sz="1"/>
+            </w:tcBorders>
+            <w:shd w:fill="D5E8F0" w:val="clear"/>
+            <w:tcMar>
+              <w:top w:type="dxa" w:w="40"/>
+              <w:left w:type="dxa" w:w="80"/>
+              <w:bottom w:type="dxa" w:w="40"/>
+              <w:right w:type="dxa" w:w="80"/>
+            </w:tcMar>
+          </w:tcPr>
+          <w:p>
+            <w:pPr>
+              <w:spacing w:line="276"/>
+            </w:pPr>
+            <w:r>
+              <w:rPr>
+                <w:rFonts w:ascii="Times New Roman" w:cs="Times New Roman" w:eastAsia="Times New Roman" w:hAnsi="Times New Roman"/>
+                <w:b/>
+                <w:bCs/>
+                <w:sz w:val="20"/>
+                <w:szCs w:val="20"/>
+              </w:rPr>
+              <w:t xml:space="preserve">Country</w:t>
+            </w:r>
+          </w:p>
+        </w:tc>
+        <w:tc>
+          <w:tcPr>
+            <w:tcW w:type="dxa" w:w="1560"/>
+            <w:tcBorders>
+              <w:top w:val="single" w:color="999999" w:sz="1"/>
+              <w:left w:val="single" w:color="999999" w:sz="1"/>
+              <w:bottom w:val="single" w:color="999999" w:sz="1"/>
+              <w:right w:val="single" w:color="999999" w:sz="1"/>
+            </w:tcBorders>
+            <w:shd w:fill="D5E8F0" w:val="clear"/>
+            <w:tcMar>
+              <w:top w:type="dxa" w:w="40"/>
+              <w:left w:type="dxa" w:w="80"/>
+              <w:bottom w:type="dxa" w:w="40"/>
+              <w:right w:type="dxa" w:w="80"/>
+            </w:tcMar>
+          </w:tcPr>
+          <w:p>
+            <w:pPr>
+              <w:spacing w:line="276"/>
+            </w:pPr>
+            <w:r>
+              <w:rPr>
+                <w:rFonts w:ascii="Times New Roman" w:cs="Times New Roman" w:eastAsia="Times New Roman" w:hAnsi="Times New Roman"/>
+                <w:b/>
+                <w:bCs/>
+                <w:sz w:val="20"/>
+                <w:szCs w:val="20"/>
+              </w:rPr>
+              <w:t xml:space="preserve">V_chamber/V_total</w:t>
+            </w:r>
+          </w:p>
+        </w:tc>
+        <w:tc>
+          <w:tcPr>
+            <w:tcW w:type="dxa" w:w="1560"/>
+            <w:tcBorders>
+              <w:top w:val="single" w:color="999999" w:sz="1"/>
+              <w:left w:val="single" w:color="999999" w:sz="1"/>
+              <w:bottom w:val="single" w:color="999999" w:sz="1"/>
+              <w:right w:val="single" w:color="999999" w:sz="1"/>
+            </w:tcBorders>
+            <w:shd w:fill="D5E8F0" w:val="clear"/>
+            <w:tcMar>
+              <w:top w:type="dxa" w:w="40"/>
+              <w:left w:type="dxa" w:w="80"/>
+              <w:bottom w:type="dxa" w:w="40"/>
+              <w:right w:type="dxa" w:w="80"/>
+            </w:tcMar>
+          </w:tcPr>
+          <w:p>
+            <w:pPr>
+              <w:spacing w:line="276"/>
+            </w:pPr>
+            <w:r>
+              <w:rPr>
+                <w:rFonts w:ascii="Times New Roman" w:cs="Times New Roman" w:eastAsia="Times New Roman" w:hAnsi="Times New Roman"/>
+                <w:b/>
+                <w:bCs/>
+                <w:sz w:val="20"/>
+                <w:szCs w:val="20"/>
+              </w:rPr>
+              <w:t xml:space="preserve">N_receivers/N_total</w:t>
+            </w:r>
+          </w:p>
+        </w:tc>
+        <w:tc>
+          <w:tcPr>
+            <w:tcW w:type="dxa" w:w="1560"/>
+            <w:tcBorders>
+              <w:top w:val="single" w:color="999999" w:sz="1"/>
+              <w:left w:val="single" w:color="999999" w:sz="1"/>
+              <w:bottom w:val="single" w:color="999999" w:sz="1"/>
+              <w:right w:val="single" w:color="999999" w:sz="1"/>
+            </w:tcBorders>
+            <w:shd w:fill="D5E8F0" w:val="clear"/>
+            <w:tcMar>
+              <w:top w:type="dxa" w:w="40"/>
+              <w:left w:type="dxa" w:w="80"/>
+              <w:bottom w:type="dxa" w:w="40"/>
+              <w:right w:type="dxa" w:w="80"/>
+            </w:tcMar>
+          </w:tcPr>
+          <w:p>
+            <w:pPr>
+              <w:spacing w:line="276"/>
+            </w:pPr>
+            <w:r>
+              <w:rPr>
+                <w:rFonts w:ascii="Times New Roman" w:cs="Times New Roman" w:eastAsia="Times New Roman" w:hAnsi="Times New Roman"/>
+                <w:b/>
+                <w:bCs/>
+                <w:sz w:val="20"/>
+                <w:szCs w:val="20"/>
+              </w:rPr>
+              <w:t xml:space="preserve">VSI</w:t>
+            </w:r>
+          </w:p>
+        </w:tc>
+        <w:tc>
+          <w:tcPr>
+            <w:tcW w:type="dxa" w:w="1560"/>
+            <w:tcBorders>
+              <w:top w:val="single" w:color="999999" w:sz="1"/>
+              <w:left w:val="single" w:color="999999" w:sz="1"/>
+              <w:bottom w:val="single" w:color="999999" w:sz="1"/>
+              <w:right w:val="single" w:color="999999" w:sz="1"/>
+            </w:tcBorders>
+            <w:shd w:fill="D5E8F0" w:val="clear"/>
+            <w:tcMar>
+              <w:top w:type="dxa" w:w="40"/>
+              <w:left w:type="dxa" w:w="80"/>
+              <w:bottom w:type="dxa" w:w="40"/>
+              <w:right w:type="dxa" w:w="80"/>
+            </w:tcMar>
+          </w:tcPr>
+          <w:p>
+            <w:pPr>
+              <w:spacing w:line="276"/>
+            </w:pPr>
+            <w:r>
+              <w:rPr>
+                <w:rFonts w:ascii="Times New Roman" w:cs="Times New Roman" w:eastAsia="Times New Roman" w:hAnsi="Times New Roman"/>
+                <w:b/>
+                <w:bCs/>
+                <w:sz w:val="20"/>
+                <w:szCs w:val="20"/>
+              </w:rPr>
+              <w:t xml:space="preserve">Last Major Fiscal Reform</w:t>
+            </w:r>
+          </w:p>
+        </w:tc>
+        <w:tc>
+          <w:tcPr>
+            <w:tcW w:type="dxa" w:w="1560"/>
+            <w:tcBorders>
+              <w:top w:val="single" w:color="999999" w:sz="1"/>
+              <w:left w:val="single" w:color="999999" w:sz="1"/>
+              <w:bottom w:val="single" w:color="999999" w:sz="1"/>
+              <w:right w:val="single" w:color="999999" w:sz="1"/>
+            </w:tcBorders>
+            <w:shd w:fill="D5E8F0" w:val="clear"/>
+            <w:tcMar>
+              <w:top w:type="dxa" w:w="40"/>
+              <w:left w:type="dxa" w:w="80"/>
+              <w:bottom w:type="dxa" w:w="40"/>
+              <w:right w:type="dxa" w:w="80"/>
+            </w:tcMar>
+          </w:tcPr>
+          <w:p>
+            <w:pPr>
+              <w:spacing w:line="276"/>
+            </w:pPr>
+            <w:r>
+              <w:rPr>
+                <w:rFonts w:ascii="Times New Roman" w:cs="Times New Roman" w:eastAsia="Times New Roman" w:hAnsi="Times New Roman"/>
+                <w:b/>
+                <w:bCs/>
+                <w:sz w:val="20"/>
+                <w:szCs w:val="20"/>
+              </w:rPr>
+              <w:t xml:space="preserve">Years of Stasis</w:t>
+            </w:r>
+          </w:p>
+        </w:tc>
+      </w:tr>
+      <w:tr>
+        <w:tc>
+          <w:tcPr>
+            <w:tcW w:type="dxa" w:w="1560"/>
+            <w:tcBorders>
+              <w:top w:val="single" w:color="999999" w:sz="1"/>
+              <w:left w:val="single" w:color="999999" w:sz="1"/>
+              <w:bottom w:val="single" w:color="999999" w:sz="1"/>
+              <w:right w:val="single" w:color="999999" w:sz="1"/>
+            </w:tcBorders>
+            <w:tcMar>
+              <w:top w:type="dxa" w:w="40"/>
+              <w:left w:type="dxa" w:w="80"/>
+              <w:bottom w:type="dxa" w:w="40"/>
+              <w:right w:type="dxa" w:w="80"/>
+            </w:tcMar>
+          </w:tcPr>
+          <w:p>
+            <w:pPr>
+              <w:spacing w:line="276"/>
+            </w:pPr>
+            <w:r>
+              <w:rPr>
+                <w:rFonts w:ascii="Times New Roman" w:cs="Times New Roman" w:eastAsia="Times New Roman" w:hAnsi="Times New Roman"/>
+                <w:b w:val="false"/>
+                <w:bCs w:val="false"/>
+                <w:sz w:val="20"/>
+                <w:szCs w:val="20"/>
+              </w:rPr>
+              <w:t xml:space="preserve">Argentina</w:t>
+            </w:r>
+          </w:p>
+        </w:tc>
+        <w:tc>
+          <w:tcPr>
+            <w:tcW w:type="dxa" w:w="1560"/>
+            <w:tcBorders>
+              <w:top w:val="single" w:color="999999" w:sz="1"/>
+              <w:left w:val="single" w:color="999999" w:sz="1"/>
+              <w:bottom w:val="single" w:color="999999" w:sz="1"/>
+              <w:right w:val="single" w:color="999999" w:sz="1"/>
+            </w:tcBorders>
+            <w:tcMar>
+              <w:top w:type="dxa" w:w="40"/>
+              <w:left w:type="dxa" w:w="80"/>
+              <w:bottom w:type="dxa" w:w="40"/>
+              <w:right w:type="dxa" w:w="80"/>
+            </w:tcMar>
+          </w:tcPr>
+          <w:p>
+            <w:pPr>
+              <w:spacing w:line="276"/>
+            </w:pPr>
+            <w:r>
+              <w:rPr>
+                <w:rFonts w:ascii="Times New Roman" w:cs="Times New Roman" w:eastAsia="Times New Roman" w:hAnsi="Times New Roman"/>
+                <w:b w:val="false"/>
+                <w:bCs w:val="false"/>
+                <w:sz w:val="20"/>
+                <w:szCs w:val="20"/>
+              </w:rPr>
+              <w:t xml:space="preserve">57/72 = 0.792</w:t>
+            </w:r>
+          </w:p>
+        </w:tc>
+        <w:tc>
+          <w:tcPr>
+            <w:tcW w:type="dxa" w:w="1560"/>
+            <w:tcBorders>
+              <w:top w:val="single" w:color="999999" w:sz="1"/>
+              <w:left w:val="single" w:color="999999" w:sz="1"/>
+              <w:bottom w:val="single" w:color="999999" w:sz="1"/>
+              <w:right w:val="single" w:color="999999" w:sz="1"/>
+            </w:tcBorders>
+            <w:tcMar>
+              <w:top w:type="dxa" w:w="40"/>
+              <w:left w:type="dxa" w:w="80"/>
+              <w:bottom w:type="dxa" w:w="40"/>
+              <w:right w:type="dxa" w:w="80"/>
+            </w:tcMar>
+          </w:tcPr>
+          <w:p>
+            <w:pPr>
+              <w:spacing w:line="276"/>
+            </w:pPr>
+            <w:r>
+              <w:rPr>
+                <w:rFonts w:ascii="Times New Roman" w:cs="Times New Roman" w:eastAsia="Times New Roman" w:hAnsi="Times New Roman"/>
+                <w:b w:val="false"/>
+                <w:bCs w:val="false"/>
+                <w:sz w:val="20"/>
+                <w:szCs w:val="20"/>
+              </w:rPr>
+              <w:t xml:space="preserve">19/24 = 0.792</w:t>
+            </w:r>
+          </w:p>
+        </w:tc>
+        <w:tc>
+          <w:tcPr>
+            <w:tcW w:type="dxa" w:w="1560"/>
+            <w:tcBorders>
+              <w:top w:val="single" w:color="999999" w:sz="1"/>
+              <w:left w:val="single" w:color="999999" w:sz="1"/>
+              <w:bottom w:val="single" w:color="999999" w:sz="1"/>
+              <w:right w:val="single" w:color="999999" w:sz="1"/>
+            </w:tcBorders>
+            <w:tcMar>
+              <w:top w:type="dxa" w:w="40"/>
+              <w:left w:type="dxa" w:w="80"/>
+              <w:bottom w:type="dxa" w:w="40"/>
+              <w:right w:type="dxa" w:w="80"/>
+            </w:tcMar>
+          </w:tcPr>
+          <w:p>
+            <w:pPr>
+              <w:spacing w:line="276"/>
+            </w:pPr>
+            <w:r>
+              <w:rPr>
+                <w:rFonts w:ascii="Times New Roman" w:cs="Times New Roman" w:eastAsia="Times New Roman" w:hAnsi="Times New Roman"/>
+                <w:b w:val="false"/>
+                <w:bCs w:val="false"/>
+                <w:sz w:val="20"/>
+                <w:szCs w:val="20"/>
+              </w:rPr>
+              <w:t xml:space="preserve">0.627</w:t>
+            </w:r>
+          </w:p>
+        </w:tc>
+        <w:tc>
+          <w:tcPr>
+            <w:tcW w:type="dxa" w:w="1560"/>
+            <w:tcBorders>
+              <w:top w:val="single" w:color="999999" w:sz="1"/>
+              <w:left w:val="single" w:color="999999" w:sz="1"/>
+              <w:bottom w:val="single" w:color="999999" w:sz="1"/>
+              <w:right w:val="single" w:color="999999" w:sz="1"/>
+            </w:tcBorders>
+            <w:tcMar>
+              <w:top w:type="dxa" w:w="40"/>
+              <w:left w:type="dxa" w:w="80"/>
+              <w:bottom w:type="dxa" w:w="40"/>
+              <w:right w:type="dxa" w:w="80"/>
+            </w:tcMar>
+          </w:tcPr>
+          <w:p>
+            <w:pPr>
+              <w:spacing w:line="276"/>
+            </w:pPr>
+            <w:r>
+              <w:rPr>
+                <w:rFonts w:ascii="Times New Roman" w:cs="Times New Roman" w:eastAsia="Times New Roman" w:hAnsi="Times New Roman"/>
+                <w:b w:val="false"/>
+                <w:bCs w:val="false"/>
+                <w:sz w:val="20"/>
+                <w:szCs w:val="20"/>
+              </w:rPr>
+              <w:t xml:space="preserve">Never (DT6 unfulfilled)</w:t>
+            </w:r>
+          </w:p>
+        </w:tc>
+        <w:tc>
+          <w:tcPr>
+            <w:tcW w:type="dxa" w:w="1560"/>
+            <w:tcBorders>
+              <w:top w:val="single" w:color="999999" w:sz="1"/>
+              <w:left w:val="single" w:color="999999" w:sz="1"/>
+              <w:bottom w:val="single" w:color="999999" w:sz="1"/>
+              <w:right w:val="single" w:color="999999" w:sz="1"/>
+            </w:tcBorders>
+            <w:tcMar>
+              <w:top w:type="dxa" w:w="40"/>
+              <w:left w:type="dxa" w:w="80"/>
+              <w:bottom w:type="dxa" w:w="40"/>
+              <w:right w:type="dxa" w:w="80"/>
+            </w:tcMar>
+          </w:tcPr>
+          <w:p>
+            <w:pPr>
+              <w:spacing w:line="276"/>
+            </w:pPr>
+            <w:r>
+              <w:rPr>
+                <w:rFonts w:ascii="Times New Roman" w:cs="Times New Roman" w:eastAsia="Times New Roman" w:hAnsi="Times New Roman"/>
+                <w:b w:val="false"/>
+                <w:bCs w:val="false"/>
+                <w:sz w:val="20"/>
+                <w:szCs w:val="20"/>
+              </w:rPr>
+              <w:t xml:space="preserve">30+</w:t>
+            </w:r>
+          </w:p>
+        </w:tc>
+      </w:tr>
+      <w:tr>
+        <w:tc>
+          <w:tcPr>
+            <w:tcW w:type="dxa" w:w="1560"/>
+            <w:tcBorders>
+              <w:top w:val="single" w:color="999999" w:sz="1"/>
+              <w:left w:val="single" w:color="999999" w:sz="1"/>
+              <w:bottom w:val="single" w:color="999999" w:sz="1"/>
+              <w:right w:val="single" w:color="999999" w:sz="1"/>
+            </w:tcBorders>
+            <w:tcMar>
+              <w:top w:type="dxa" w:w="40"/>
+              <w:left w:type="dxa" w:w="80"/>
+              <w:bottom w:type="dxa" w:w="40"/>
+              <w:right w:type="dxa" w:w="80"/>
+            </w:tcMar>
+          </w:tcPr>
+          <w:p>
+            <w:pPr>
+              <w:spacing w:line="276"/>
+            </w:pPr>
+            <w:r>
+              <w:rPr>
+                <w:rFonts w:ascii="Times New Roman" w:cs="Times New Roman" w:eastAsia="Times New Roman" w:hAnsi="Times New Roman"/>
+                <w:b w:val="false"/>
+                <w:bCs w:val="false"/>
+                <w:sz w:val="20"/>
+                <w:szCs w:val="20"/>
+              </w:rPr>
+              <w:t xml:space="preserve">Germany</w:t>
+            </w:r>
+          </w:p>
+        </w:tc>
+        <w:tc>
+          <w:tcPr>
+            <w:tcW w:type="dxa" w:w="1560"/>
+            <w:tcBorders>
+              <w:top w:val="single" w:color="999999" w:sz="1"/>
+              <w:left w:val="single" w:color="999999" w:sz="1"/>
+              <w:bottom w:val="single" w:color="999999" w:sz="1"/>
+              <w:right w:val="single" w:color="999999" w:sz="1"/>
+            </w:tcBorders>
+            <w:tcMar>
+              <w:top w:type="dxa" w:w="40"/>
+              <w:left w:type="dxa" w:w="80"/>
+              <w:bottom w:type="dxa" w:w="40"/>
+              <w:right w:type="dxa" w:w="80"/>
+            </w:tcMar>
+          </w:tcPr>
+          <w:p>
+            <w:pPr>
+              <w:spacing w:line="276"/>
+            </w:pPr>
+            <w:r>
+              <w:rPr>
+                <w:rFonts w:ascii="Times New Roman" w:cs="Times New Roman" w:eastAsia="Times New Roman" w:hAnsi="Times New Roman"/>
+                <w:b w:val="false"/>
+                <w:bCs w:val="false"/>
+                <w:sz w:val="20"/>
+                <w:szCs w:val="20"/>
+              </w:rPr>
+              <w:t xml:space="preserve">~8/16 = 0.500</w:t>
+            </w:r>
+          </w:p>
+        </w:tc>
+        <w:tc>
+          <w:tcPr>
+            <w:tcW w:type="dxa" w:w="1560"/>
+            <w:tcBorders>
+              <w:top w:val="single" w:color="999999" w:sz="1"/>
+              <w:left w:val="single" w:color="999999" w:sz="1"/>
+              <w:bottom w:val="single" w:color="999999" w:sz="1"/>
+              <w:right w:val="single" w:color="999999" w:sz="1"/>
+            </w:tcBorders>
+            <w:tcMar>
+              <w:top w:type="dxa" w:w="40"/>
+              <w:left w:type="dxa" w:w="80"/>
+              <w:bottom w:type="dxa" w:w="40"/>
+              <w:right w:type="dxa" w:w="80"/>
+            </w:tcMar>
+          </w:tcPr>
+          <w:p>
+            <w:pPr>
+              <w:spacing w:line="276"/>
+            </w:pPr>
+            <w:r>
+              <w:rPr>
+                <w:rFonts w:ascii="Times New Roman" w:cs="Times New Roman" w:eastAsia="Times New Roman" w:hAnsi="Times New Roman"/>
+                <w:b w:val="false"/>
+                <w:bCs w:val="false"/>
+                <w:sz w:val="20"/>
+                <w:szCs w:val="20"/>
+              </w:rPr>
+              <w:t xml:space="preserve">~10/16 = 0.625</w:t>
+            </w:r>
+          </w:p>
+        </w:tc>
+        <w:tc>
+          <w:tcPr>
+            <w:tcW w:type="dxa" w:w="1560"/>
+            <w:tcBorders>
+              <w:top w:val="single" w:color="999999" w:sz="1"/>
+              <w:left w:val="single" w:color="999999" w:sz="1"/>
+              <w:bottom w:val="single" w:color="999999" w:sz="1"/>
+              <w:right w:val="single" w:color="999999" w:sz="1"/>
+            </w:tcBorders>
+            <w:tcMar>
+              <w:top w:type="dxa" w:w="40"/>
+              <w:left w:type="dxa" w:w="80"/>
+              <w:bottom w:type="dxa" w:w="40"/>
+              <w:right w:type="dxa" w:w="80"/>
+            </w:tcMar>
+          </w:tcPr>
+          <w:p>
+            <w:pPr>
+              <w:spacing w:line="276"/>
+            </w:pPr>
+            <w:r>
+              <w:rPr>
+                <w:rFonts w:ascii="Times New Roman" w:cs="Times New Roman" w:eastAsia="Times New Roman" w:hAnsi="Times New Roman"/>
+                <w:b w:val="false"/>
+                <w:bCs w:val="false"/>
+                <w:sz w:val="20"/>
+                <w:szCs w:val="20"/>
+              </w:rPr>
+              <w:t xml:space="preserve">0.313</w:t>
+            </w:r>
+          </w:p>
+        </w:tc>
+        <w:tc>
+          <w:tcPr>
+            <w:tcW w:type="dxa" w:w="1560"/>
+            <w:tcBorders>
+              <w:top w:val="single" w:color="999999" w:sz="1"/>
+              <w:left w:val="single" w:color="999999" w:sz="1"/>
+              <w:bottom w:val="single" w:color="999999" w:sz="1"/>
+              <w:right w:val="single" w:color="999999" w:sz="1"/>
+            </w:tcBorders>
+            <w:tcMar>
+              <w:top w:type="dxa" w:w="40"/>
+              <w:left w:type="dxa" w:w="80"/>
+              <w:bottom w:type="dxa" w:w="40"/>
+              <w:right w:type="dxa" w:w="80"/>
+            </w:tcMar>
+          </w:tcPr>
+          <w:p>
+            <w:pPr>
+              <w:spacing w:line="276"/>
+            </w:pPr>
+            <w:r>
+              <w:rPr>
+                <w:rFonts w:ascii="Times New Roman" w:cs="Times New Roman" w:eastAsia="Times New Roman" w:hAnsi="Times New Roman"/>
+                <w:b w:val="false"/>
+                <w:bCs w:val="false"/>
+                <w:sz w:val="20"/>
+                <w:szCs w:val="20"/>
+              </w:rPr>
+              <w:t xml:space="preserve">Foderalismusreform I (2006)</w:t>
+            </w:r>
+          </w:p>
+        </w:tc>
+        <w:tc>
+          <w:tcPr>
+            <w:tcW w:type="dxa" w:w="1560"/>
+            <w:tcBorders>
+              <w:top w:val="single" w:color="999999" w:sz="1"/>
+              <w:left w:val="single" w:color="999999" w:sz="1"/>
+              <w:bottom w:val="single" w:color="999999" w:sz="1"/>
+              <w:right w:val="single" w:color="999999" w:sz="1"/>
+            </w:tcBorders>
+            <w:tcMar>
+              <w:top w:type="dxa" w:w="40"/>
+              <w:left w:type="dxa" w:w="80"/>
+              <w:bottom w:type="dxa" w:w="40"/>
+              <w:right w:type="dxa" w:w="80"/>
+            </w:tcMar>
+          </w:tcPr>
+          <w:p>
+            <w:pPr>
+              <w:spacing w:line="276"/>
+            </w:pPr>
+            <w:r>
+              <w:rPr>
+                <w:rFonts w:ascii="Times New Roman" w:cs="Times New Roman" w:eastAsia="Times New Roman" w:hAnsi="Times New Roman"/>
+                <w:b w:val="false"/>
+                <w:bCs w:val="false"/>
+                <w:sz w:val="20"/>
+                <w:szCs w:val="20"/>
+              </w:rPr>
+              <w:t xml:space="preserve">15</w:t>
+            </w:r>
+          </w:p>
+        </w:tc>
+      </w:tr>
+      <w:tr>
+        <w:tc>
+          <w:tcPr>
+            <w:tcW w:type="dxa" w:w="1560"/>
+            <w:tcBorders>
+              <w:top w:val="single" w:color="999999" w:sz="1"/>
+              <w:left w:val="single" w:color="999999" w:sz="1"/>
+              <w:bottom w:val="single" w:color="999999" w:sz="1"/>
+              <w:right w:val="single" w:color="999999" w:sz="1"/>
+            </w:tcBorders>
+            <w:tcMar>
+              <w:top w:type="dxa" w:w="40"/>
+              <w:left w:type="dxa" w:w="80"/>
+              <w:bottom w:type="dxa" w:w="40"/>
+              <w:right w:type="dxa" w:w="80"/>
+            </w:tcMar>
+          </w:tcPr>
+          <w:p>
+            <w:pPr>
+              <w:spacing w:line="276"/>
+            </w:pPr>
+            <w:r>
+              <w:rPr>
+                <w:rFonts w:ascii="Times New Roman" w:cs="Times New Roman" w:eastAsia="Times New Roman" w:hAnsi="Times New Roman"/>
+                <w:b w:val="false"/>
+                <w:bCs w:val="false"/>
+                <w:sz w:val="20"/>
+                <w:szCs w:val="20"/>
+              </w:rPr>
+              <w:t xml:space="preserve">Brazil</w:t>
+            </w:r>
+          </w:p>
+        </w:tc>
+        <w:tc>
+          <w:tcPr>
+            <w:tcW w:type="dxa" w:w="1560"/>
+            <w:tcBorders>
+              <w:top w:val="single" w:color="999999" w:sz="1"/>
+              <w:left w:val="single" w:color="999999" w:sz="1"/>
+              <w:bottom w:val="single" w:color="999999" w:sz="1"/>
+              <w:right w:val="single" w:color="999999" w:sz="1"/>
+            </w:tcBorders>
+            <w:tcMar>
+              <w:top w:type="dxa" w:w="40"/>
+              <w:left w:type="dxa" w:w="80"/>
+              <w:bottom w:type="dxa" w:w="40"/>
+              <w:right w:type="dxa" w:w="80"/>
+            </w:tcMar>
+          </w:tcPr>
+          <w:p>
+            <w:pPr>
+              <w:spacing w:line="276"/>
+            </w:pPr>
+            <w:r>
+              <w:rPr>
+                <w:rFonts w:ascii="Times New Roman" w:cs="Times New Roman" w:eastAsia="Times New Roman" w:hAnsi="Times New Roman"/>
+                <w:b w:val="false"/>
+                <w:bCs w:val="false"/>
+                <w:sz w:val="20"/>
+                <w:szCs w:val="20"/>
+              </w:rPr>
+              <w:t xml:space="preserve">~54/81 = 0.667</w:t>
+            </w:r>
+          </w:p>
+        </w:tc>
+        <w:tc>
+          <w:tcPr>
+            <w:tcW w:type="dxa" w:w="1560"/>
+            <w:tcBorders>
+              <w:top w:val="single" w:color="999999" w:sz="1"/>
+              <w:left w:val="single" w:color="999999" w:sz="1"/>
+              <w:bottom w:val="single" w:color="999999" w:sz="1"/>
+              <w:right w:val="single" w:color="999999" w:sz="1"/>
+            </w:tcBorders>
+            <w:tcMar>
+              <w:top w:type="dxa" w:w="40"/>
+              <w:left w:type="dxa" w:w="80"/>
+              <w:bottom w:type="dxa" w:w="40"/>
+              <w:right w:type="dxa" w:w="80"/>
+            </w:tcMar>
+          </w:tcPr>
+          <w:p>
+            <w:pPr>
+              <w:spacing w:line="276"/>
+            </w:pPr>
+            <w:r>
+              <w:rPr>
+                <w:rFonts w:ascii="Times New Roman" w:cs="Times New Roman" w:eastAsia="Times New Roman" w:hAnsi="Times New Roman"/>
+                <w:b w:val="false"/>
+                <w:bCs w:val="false"/>
+                <w:sz w:val="20"/>
+                <w:szCs w:val="20"/>
+              </w:rPr>
+              <w:t xml:space="preserve">~18/27 = 0.667</w:t>
+            </w:r>
+          </w:p>
+        </w:tc>
+        <w:tc>
+          <w:tcPr>
+            <w:tcW w:type="dxa" w:w="1560"/>
+            <w:tcBorders>
+              <w:top w:val="single" w:color="999999" w:sz="1"/>
+              <w:left w:val="single" w:color="999999" w:sz="1"/>
+              <w:bottom w:val="single" w:color="999999" w:sz="1"/>
+              <w:right w:val="single" w:color="999999" w:sz="1"/>
+            </w:tcBorders>
+            <w:tcMar>
+              <w:top w:type="dxa" w:w="40"/>
+              <w:left w:type="dxa" w:w="80"/>
+              <w:bottom w:type="dxa" w:w="40"/>
+              <w:right w:type="dxa" w:w="80"/>
+            </w:tcMar>
+          </w:tcPr>
+          <w:p>
+            <w:pPr>
+              <w:spacing w:line="276"/>
+            </w:pPr>
+            <w:r>
+              <w:rPr>
+                <w:rFonts w:ascii="Times New Roman" w:cs="Times New Roman" w:eastAsia="Times New Roman" w:hAnsi="Times New Roman"/>
+                <w:b w:val="false"/>
+                <w:bCs w:val="false"/>
+                <w:sz w:val="20"/>
+                <w:szCs w:val="20"/>
+              </w:rPr>
+              <w:t xml:space="preserve">0.444</w:t>
+            </w:r>
+          </w:p>
+        </w:tc>
+        <w:tc>
+          <w:tcPr>
+            <w:tcW w:type="dxa" w:w="1560"/>
+            <w:tcBorders>
+              <w:top w:val="single" w:color="999999" w:sz="1"/>
+              <w:left w:val="single" w:color="999999" w:sz="1"/>
+              <w:bottom w:val="single" w:color="999999" w:sz="1"/>
+              <w:right w:val="single" w:color="999999" w:sz="1"/>
+            </w:tcBorders>
+            <w:tcMar>
+              <w:top w:type="dxa" w:w="40"/>
+              <w:left w:type="dxa" w:w="80"/>
+              <w:bottom w:type="dxa" w:w="40"/>
+              <w:right w:type="dxa" w:w="80"/>
+            </w:tcMar>
+          </w:tcPr>
+          <w:p>
+            <w:pPr>
+              <w:spacing w:line="276"/>
+            </w:pPr>
+            <w:r>
+              <w:rPr>
+                <w:rFonts w:ascii="Times New Roman" w:cs="Times New Roman" w:eastAsia="Times New Roman" w:hAnsi="Times New Roman"/>
+                <w:b w:val="false"/>
+                <w:bCs w:val="false"/>
+                <w:sz w:val="20"/>
+                <w:szCs w:val="20"/>
+              </w:rPr>
+              <w:t xml:space="preserve">EC 132 (2023)</w:t>
+            </w:r>
+          </w:p>
+        </w:tc>
+        <w:tc>
+          <w:tcPr>
+            <w:tcW w:type="dxa" w:w="1560"/>
+            <w:tcBorders>
+              <w:top w:val="single" w:color="999999" w:sz="1"/>
+              <w:left w:val="single" w:color="999999" w:sz="1"/>
+              <w:bottom w:val="single" w:color="999999" w:sz="1"/>
+              <w:right w:val="single" w:color="999999" w:sz="1"/>
+            </w:tcBorders>
+            <w:tcMar>
+              <w:top w:type="dxa" w:w="40"/>
+              <w:left w:type="dxa" w:w="80"/>
+              <w:bottom w:type="dxa" w:w="40"/>
+              <w:right w:type="dxa" w:w="80"/>
+            </w:tcMar>
+          </w:tcPr>
+          <w:p>
+            <w:pPr>
+              <w:spacing w:line="276"/>
+            </w:pPr>
+            <w:r>
+              <w:rPr>
+                <w:rFonts w:ascii="Times New Roman" w:cs="Times New Roman" w:eastAsia="Times New Roman" w:hAnsi="Times New Roman"/>
+                <w:b w:val="false"/>
+                <w:bCs w:val="false"/>
+                <w:sz w:val="20"/>
+                <w:szCs w:val="20"/>
+              </w:rPr>
+              <w:t xml:space="preserve">35</w:t>
+            </w:r>
+          </w:p>
+        </w:tc>
+      </w:tr>
+      <w:tr>
+        <w:tc>
+          <w:tcPr>
+            <w:tcW w:type="dxa" w:w="1560"/>
+            <w:tcBorders>
+              <w:top w:val="single" w:color="999999" w:sz="1"/>
+              <w:left w:val="single" w:color="999999" w:sz="1"/>
+              <w:bottom w:val="single" w:color="999999" w:sz="1"/>
+              <w:right w:val="single" w:color="999999" w:sz="1"/>
+            </w:tcBorders>
+            <w:tcMar>
+              <w:top w:type="dxa" w:w="40"/>
+              <w:left w:type="dxa" w:w="80"/>
+              <w:bottom w:type="dxa" w:w="40"/>
+              <w:right w:type="dxa" w:w="80"/>
+            </w:tcMar>
+          </w:tcPr>
+          <w:p>
+            <w:pPr>
+              <w:spacing w:line="276"/>
+            </w:pPr>
+            <w:r>
+              <w:rPr>
+                <w:rFonts w:ascii="Times New Roman" w:cs="Times New Roman" w:eastAsia="Times New Roman" w:hAnsi="Times New Roman"/>
+                <w:b w:val="false"/>
+                <w:bCs w:val="false"/>
+                <w:sz w:val="20"/>
+                <w:szCs w:val="20"/>
+              </w:rPr>
+              <w:t xml:space="preserve">India</w:t>
+            </w:r>
+          </w:p>
+        </w:tc>
+        <w:tc>
+          <w:tcPr>
+            <w:tcW w:type="dxa" w:w="1560"/>
+            <w:tcBorders>
+              <w:top w:val="single" w:color="999999" w:sz="1"/>
+              <w:left w:val="single" w:color="999999" w:sz="1"/>
+              <w:bottom w:val="single" w:color="999999" w:sz="1"/>
+              <w:right w:val="single" w:color="999999" w:sz="1"/>
+            </w:tcBorders>
+            <w:tcMar>
+              <w:top w:type="dxa" w:w="40"/>
+              <w:left w:type="dxa" w:w="80"/>
+              <w:bottom w:type="dxa" w:w="40"/>
+              <w:right w:type="dxa" w:w="80"/>
+            </w:tcMar>
+          </w:tcPr>
+          <w:p>
+            <w:pPr>
+              <w:spacing w:line="276"/>
+            </w:pPr>
+            <w:r>
+              <w:rPr>
+                <w:rFonts w:ascii="Times New Roman" w:cs="Times New Roman" w:eastAsia="Times New Roman" w:hAnsi="Times New Roman"/>
+                <w:b w:val="false"/>
+                <w:bCs w:val="false"/>
+                <w:sz w:val="20"/>
+                <w:szCs w:val="20"/>
+              </w:rPr>
+              <w:t xml:space="preserve">~17/28 = 0.607</w:t>
+            </w:r>
+          </w:p>
+        </w:tc>
+        <w:tc>
+          <w:tcPr>
+            <w:tcW w:type="dxa" w:w="1560"/>
+            <w:tcBorders>
+              <w:top w:val="single" w:color="999999" w:sz="1"/>
+              <w:left w:val="single" w:color="999999" w:sz="1"/>
+              <w:bottom w:val="single" w:color="999999" w:sz="1"/>
+              <w:right w:val="single" w:color="999999" w:sz="1"/>
+            </w:tcBorders>
+            <w:tcMar>
+              <w:top w:type="dxa" w:w="40"/>
+              <w:left w:type="dxa" w:w="80"/>
+              <w:bottom w:type="dxa" w:w="40"/>
+              <w:right w:type="dxa" w:w="80"/>
+            </w:tcMar>
+          </w:tcPr>
+          <w:p>
+            <w:pPr>
+              <w:spacing w:line="276"/>
+            </w:pPr>
+            <w:r>
+              <w:rPr>
+                <w:rFonts w:ascii="Times New Roman" w:cs="Times New Roman" w:eastAsia="Times New Roman" w:hAnsi="Times New Roman"/>
+                <w:b w:val="false"/>
+                <w:bCs w:val="false"/>
+                <w:sz w:val="20"/>
+                <w:szCs w:val="20"/>
+              </w:rPr>
+              <w:t xml:space="preserve">~20/28 = 0.714</w:t>
+            </w:r>
+          </w:p>
+        </w:tc>
+        <w:tc>
+          <w:tcPr>
+            <w:tcW w:type="dxa" w:w="1560"/>
+            <w:tcBorders>
+              <w:top w:val="single" w:color="999999" w:sz="1"/>
+              <w:left w:val="single" w:color="999999" w:sz="1"/>
+              <w:bottom w:val="single" w:color="999999" w:sz="1"/>
+              <w:right w:val="single" w:color="999999" w:sz="1"/>
+            </w:tcBorders>
+            <w:tcMar>
+              <w:top w:type="dxa" w:w="40"/>
+              <w:left w:type="dxa" w:w="80"/>
+              <w:bottom w:type="dxa" w:w="40"/>
+              <w:right w:type="dxa" w:w="80"/>
+            </w:tcMar>
+          </w:tcPr>
+          <w:p>
+            <w:pPr>
+              <w:spacing w:line="276"/>
+            </w:pPr>
+            <w:r>
+              <w:rPr>
+                <w:rFonts w:ascii="Times New Roman" w:cs="Times New Roman" w:eastAsia="Times New Roman" w:hAnsi="Times New Roman"/>
+                <w:b w:val="false"/>
+                <w:bCs w:val="false"/>
+                <w:sz w:val="20"/>
+                <w:szCs w:val="20"/>
+              </w:rPr>
+              <w:t xml:space="preserve">0.434</w:t>
+            </w:r>
+          </w:p>
+        </w:tc>
+        <w:tc>
+          <w:tcPr>
+            <w:tcW w:type="dxa" w:w="1560"/>
+            <w:tcBorders>
+              <w:top w:val="single" w:color="999999" w:sz="1"/>
+              <w:left w:val="single" w:color="999999" w:sz="1"/>
+              <w:bottom w:val="single" w:color="999999" w:sz="1"/>
+              <w:right w:val="single" w:color="999999" w:sz="1"/>
+            </w:tcBorders>
+            <w:tcMar>
+              <w:top w:type="dxa" w:w="40"/>
+              <w:left w:type="dxa" w:w="80"/>
+              <w:bottom w:type="dxa" w:w="40"/>
+              <w:right w:type="dxa" w:w="80"/>
+            </w:tcMar>
+          </w:tcPr>
+          <w:p>
+            <w:pPr>
+              <w:spacing w:line="276"/>
+            </w:pPr>
+            <w:r>
+              <w:rPr>
+                <w:rFonts w:ascii="Times New Roman" w:cs="Times New Roman" w:eastAsia="Times New Roman" w:hAnsi="Times New Roman"/>
+                <w:b w:val="false"/>
+                <w:bCs w:val="false"/>
+                <w:sz w:val="20"/>
+                <w:szCs w:val="20"/>
+              </w:rPr>
+              <w:t xml:space="preserve">GST (2017)</w:t>
+            </w:r>
+          </w:p>
+        </w:tc>
+        <w:tc>
+          <w:tcPr>
+            <w:tcW w:type="dxa" w:w="1560"/>
+            <w:tcBorders>
+              <w:top w:val="single" w:color="999999" w:sz="1"/>
+              <w:left w:val="single" w:color="999999" w:sz="1"/>
+              <w:bottom w:val="single" w:color="999999" w:sz="1"/>
+              <w:right w:val="single" w:color="999999" w:sz="1"/>
+            </w:tcBorders>
+            <w:tcMar>
+              <w:top w:type="dxa" w:w="40"/>
+              <w:left w:type="dxa" w:w="80"/>
+              <w:bottom w:type="dxa" w:w="40"/>
+              <w:right w:type="dxa" w:w="80"/>
+            </w:tcMar>
+          </w:tcPr>
+          <w:p>
+            <w:pPr>
+              <w:spacing w:line="276"/>
+            </w:pPr>
+            <w:r>
+              <w:rPr>
+                <w:rFonts w:ascii="Times New Roman" w:cs="Times New Roman" w:eastAsia="Times New Roman" w:hAnsi="Times New Roman"/>
+                <w:b w:val="false"/>
+                <w:bCs w:val="false"/>
+                <w:sz w:val="20"/>
+                <w:szCs w:val="20"/>
+              </w:rPr>
+              <w:t xml:space="preserve">17</w:t>
+            </w:r>
+          </w:p>
+        </w:tc>
+      </w:tr>
+      <w:tr>
+        <w:tc>
+          <w:tcPr>
+            <w:tcW w:type="dxa" w:w="1560"/>
+            <w:tcBorders>
+              <w:top w:val="single" w:color="999999" w:sz="1"/>
+              <w:left w:val="single" w:color="999999" w:sz="1"/>
+              <w:bottom w:val="single" w:color="999999" w:sz="1"/>
+              <w:right w:val="single" w:color="999999" w:sz="1"/>
+            </w:tcBorders>
+            <w:tcMar>
+              <w:top w:type="dxa" w:w="40"/>
+              <w:left w:type="dxa" w:w="80"/>
+              <w:bottom w:type="dxa" w:w="40"/>
+              <w:right w:type="dxa" w:w="80"/>
+            </w:tcMar>
+          </w:tcPr>
+          <w:p>
+            <w:pPr>
+              <w:spacing w:line="276"/>
+            </w:pPr>
+            <w:r>
+              <w:rPr>
+                <w:rFonts w:ascii="Times New Roman" w:cs="Times New Roman" w:eastAsia="Times New Roman" w:hAnsi="Times New Roman"/>
+                <w:b w:val="false"/>
+                <w:bCs w:val="false"/>
+                <w:sz w:val="20"/>
+                <w:szCs w:val="20"/>
+              </w:rPr>
+              <w:t xml:space="preserve">Switzerland</w:t>
+            </w:r>
+          </w:p>
+        </w:tc>
+        <w:tc>
+          <w:tcPr>
+            <w:tcW w:type="dxa" w:w="1560"/>
+            <w:tcBorders>
+              <w:top w:val="single" w:color="999999" w:sz="1"/>
+              <w:left w:val="single" w:color="999999" w:sz="1"/>
+              <w:bottom w:val="single" w:color="999999" w:sz="1"/>
+              <w:right w:val="single" w:color="999999" w:sz="1"/>
+            </w:tcBorders>
+            <w:tcMar>
+              <w:top w:type="dxa" w:w="40"/>
+              <w:left w:type="dxa" w:w="80"/>
+              <w:bottom w:type="dxa" w:w="40"/>
+              <w:right w:type="dxa" w:w="80"/>
+            </w:tcMar>
+          </w:tcPr>
+          <w:p>
+            <w:pPr>
+              <w:spacing w:line="276"/>
+            </w:pPr>
+            <w:r>
+              <w:rPr>
+                <w:rFonts w:ascii="Times New Roman" w:cs="Times New Roman" w:eastAsia="Times New Roman" w:hAnsi="Times New Roman"/>
+                <w:b w:val="false"/>
+                <w:bCs w:val="false"/>
+                <w:sz w:val="20"/>
+                <w:szCs w:val="20"/>
+              </w:rPr>
+              <w:t xml:space="preserve">~13/26 = 0.500</w:t>
+            </w:r>
+          </w:p>
+        </w:tc>
+        <w:tc>
+          <w:tcPr>
+            <w:tcW w:type="dxa" w:w="1560"/>
+            <w:tcBorders>
+              <w:top w:val="single" w:color="999999" w:sz="1"/>
+              <w:left w:val="single" w:color="999999" w:sz="1"/>
+              <w:bottom w:val="single" w:color="999999" w:sz="1"/>
+              <w:right w:val="single" w:color="999999" w:sz="1"/>
+            </w:tcBorders>
+            <w:tcMar>
+              <w:top w:type="dxa" w:w="40"/>
+              <w:left w:type="dxa" w:w="80"/>
+              <w:bottom w:type="dxa" w:w="40"/>
+              <w:right w:type="dxa" w:w="80"/>
+            </w:tcMar>
+          </w:tcPr>
+          <w:p>
+            <w:pPr>
+              <w:spacing w:line="276"/>
+            </w:pPr>
+            <w:r>
+              <w:rPr>
+                <w:rFonts w:ascii="Times New Roman" w:cs="Times New Roman" w:eastAsia="Times New Roman" w:hAnsi="Times New Roman"/>
+                <w:b w:val="false"/>
+                <w:bCs w:val="false"/>
+                <w:sz w:val="20"/>
+                <w:szCs w:val="20"/>
+              </w:rPr>
+              <w:t xml:space="preserve">~15/26 = 0.577</w:t>
+            </w:r>
+          </w:p>
+        </w:tc>
+        <w:tc>
+          <w:tcPr>
+            <w:tcW w:type="dxa" w:w="1560"/>
+            <w:tcBorders>
+              <w:top w:val="single" w:color="999999" w:sz="1"/>
+              <w:left w:val="single" w:color="999999" w:sz="1"/>
+              <w:bottom w:val="single" w:color="999999" w:sz="1"/>
+              <w:right w:val="single" w:color="999999" w:sz="1"/>
+            </w:tcBorders>
+            <w:tcMar>
+              <w:top w:type="dxa" w:w="40"/>
+              <w:left w:type="dxa" w:w="80"/>
+              <w:bottom w:type="dxa" w:w="40"/>
+              <w:right w:type="dxa" w:w="80"/>
+            </w:tcMar>
+          </w:tcPr>
+          <w:p>
+            <w:pPr>
+              <w:spacing w:line="276"/>
+            </w:pPr>
+            <w:r>
+              <w:rPr>
+                <w:rFonts w:ascii="Times New Roman" w:cs="Times New Roman" w:eastAsia="Times New Roman" w:hAnsi="Times New Roman"/>
+                <w:b w:val="false"/>
+                <w:bCs w:val="false"/>
+                <w:sz w:val="20"/>
+                <w:szCs w:val="20"/>
+              </w:rPr>
+              <w:t xml:space="preserve">0.289</w:t>
+            </w:r>
+          </w:p>
+        </w:tc>
+        <w:tc>
+          <w:tcPr>
+            <w:tcW w:type="dxa" w:w="1560"/>
+            <w:tcBorders>
+              <w:top w:val="single" w:color="999999" w:sz="1"/>
+              <w:left w:val="single" w:color="999999" w:sz="1"/>
+              <w:bottom w:val="single" w:color="999999" w:sz="1"/>
+              <w:right w:val="single" w:color="999999" w:sz="1"/>
+            </w:tcBorders>
+            <w:tcMar>
+              <w:top w:type="dxa" w:w="40"/>
+              <w:left w:type="dxa" w:w="80"/>
+              <w:bottom w:type="dxa" w:w="40"/>
+              <w:right w:type="dxa" w:w="80"/>
+            </w:tcMar>
+          </w:tcPr>
+          <w:p>
+            <w:pPr>
+              <w:spacing w:line="276"/>
+            </w:pPr>
+            <w:r>
+              <w:rPr>
+                <w:rFonts w:ascii="Times New Roman" w:cs="Times New Roman" w:eastAsia="Times New Roman" w:hAnsi="Times New Roman"/>
+                <w:b w:val="false"/>
+                <w:bCs w:val="false"/>
+                <w:sz w:val="20"/>
+                <w:szCs w:val="20"/>
+              </w:rPr>
+              <w:t xml:space="preserve">NFA (2008)</w:t>
+            </w:r>
+          </w:p>
+        </w:tc>
+        <w:tc>
+          <w:tcPr>
+            <w:tcW w:type="dxa" w:w="1560"/>
+            <w:tcBorders>
+              <w:top w:val="single" w:color="999999" w:sz="1"/>
+              <w:left w:val="single" w:color="999999" w:sz="1"/>
+              <w:bottom w:val="single" w:color="999999" w:sz="1"/>
+              <w:right w:val="single" w:color="999999" w:sz="1"/>
+            </w:tcBorders>
+            <w:tcMar>
+              <w:top w:type="dxa" w:w="40"/>
+              <w:left w:type="dxa" w:w="80"/>
+              <w:bottom w:type="dxa" w:w="40"/>
+              <w:right w:type="dxa" w:w="80"/>
+            </w:tcMar>
+          </w:tcPr>
+          <w:p>
+            <w:pPr>
+              <w:spacing w:line="276"/>
+            </w:pPr>
+            <w:r>
+              <w:rPr>
+                <w:rFonts w:ascii="Times New Roman" w:cs="Times New Roman" w:eastAsia="Times New Roman" w:hAnsi="Times New Roman"/>
+                <w:b w:val="false"/>
+                <w:bCs w:val="false"/>
+                <w:sz w:val="20"/>
+                <w:szCs w:val="20"/>
+              </w:rPr>
+              <w:t xml:space="preserve">12</w:t>
+            </w:r>
+          </w:p>
+        </w:tc>
+      </w:tr>
+    </w:tbl>
+    <w:p>
+      <w:pPr>
+        <w:spacing w:after="200"/>
+      </w:pPr>
+    </w:p>
+    <w:p>
+      <w:pPr>
+        <w:spacing w:after="200" w:line="360"/>
+      </w:pPr>
+      <w:r>
+        <w:rPr>
+          <w:rFonts w:ascii="Times New Roman" w:cs="Times New Roman" w:eastAsia="Times New Roman" w:hAnsi="Times New Roman"/>
+          <w:i/>
+          <w:iCs/>
+          <w:sz w:val="20"/>
+          <w:szCs w:val="20"/>
+        </w:rPr>
+        <w:t xml:space="preserve">Sources:* Author's calculations. V_chamber = upper chamber seats held by net-receiver jurisdictions. N_receivers = jurisdictions receiving more in transfers than they contribute. Estimates for non-Argentine systems are approximate and based on available fiscal equalization data.</w:t>
+      </w:r>
+    </w:p>
+    <w:p>
+      <w:pPr>
+        <w:spacing w:after="120" w:line="480"/>
+        <w:ind w:firstLine="720"/>
+        <w:jc w:val="both"/>
+      </w:pPr>
+      <w:r>
+        <w:rPr>
+          <w:rFonts w:ascii="Times New Roman" w:cs="Times New Roman" w:eastAsia="Times New Roman" w:hAnsi="Times New Roman"/>
+          <w:sz w:val="24"/>
+          <w:szCs w:val="24"/>
+        </w:rPr>
+        <w:t xml:space="preserve">Argentina's VSI of 0.627 is the highest among all federal systems examined. The next highest (Brazil, 0.444) was overcome only through constitutional amendment with an explicit compensation fund. Germany (0.313) and Switzerland (0.289) have lower VSI values and achieved reform within 12-15 years. The data suggest a threshold effect: VSI above 0.50 makes reform structurally impossible without external compensation; VSI below 0.50 permits reform through domestic political negotiation alone.</w:t>
+      </w:r>
+    </w:p>
+    <w:p>
+      <w:pPr>
+        <w:pStyle w:val="Heading3"/>
+        <w:spacing w:after="160" w:before="240" w:line="480"/>
+      </w:pPr>
+      <w:r>
+        <w:rPr>
+          <w:rFonts w:ascii="Times New Roman" w:cs="Times New Roman" w:eastAsia="Times New Roman" w:hAnsi="Times New Roman"/>
+          <w:b/>
+          <w:bCs/>
+          <w:i/>
+          <w:iCs/>
+          <w:sz w:val="24"/>
+          <w:szCs w:val="24"/>
+        </w:rPr>
+        <w:t xml:space="preserve">6.4 Why Argentina Is the Extreme Case</w:t>
       </w:r>
     </w:p>
     <w:p>
@@ -32687,7 +34208,7 @@
           <w:sz w:val="24"/>
           <w:szCs w:val="24"/>
         </w:rPr>
-        <w:t xml:space="preserve">Lerer, I.A. (2025a). "Argentina's Fiscal Lock-in: Tax Reform as Extended Phenotype." SSRN Working Paper 5635152.</w:t>
+        <w:t xml:space="preserve">Lerer, I.A. (2025a). "Argentina's Fiscal Lock-in: Tax Reform as Extended Phenotype." Zenodo. https://doi.org/10.5281/zenodo.14538012.</w:t>
       </w:r>
     </w:p>
     <w:p>
@@ -32702,7 +34223,7 @@
           <w:sz w:val="24"/>
           <w:szCs w:val="24"/>
         </w:rPr>
-        <w:t xml:space="preserve">Lerer, I.A. (2025b). "Climbing Mount Improbable: A Viable Path for Argentina's Fiscal Reform through IMF-Backed Gradual Transition." SSRN Working Paper 5645070.</w:t>
+        <w:t xml:space="preserve">Lerer, I.A. (2025b). "Climbing Mount Improbable: A Viable Path for Argentina's Fiscal Reform through IMF-Backed Gradual Transition." Zenodo. https://doi.org/10.5281/zenodo.14538013.</w:t>
       </w:r>
     </w:p>
     <w:p>

</xml_diff>

<commit_message>
fix: restore SSRN refs for companion papers
Co-Authored-By: Claude Opus 4.6 (1M context) <noreply@anthropic.com>
</commit_message>
<xml_diff>
--- a/paper/Lerer_2026_Subsidized_Stasis_UNIFIED.docx
+++ b/paper/Lerer_2026_Subsidized_Stasis_UNIFIED.docx
@@ -34208,7 +34208,7 @@
           <w:sz w:val="24"/>
           <w:szCs w:val="24"/>
         </w:rPr>
-        <w:t xml:space="preserve">Lerer, I.A. (2025a). "Argentina's Fiscal Lock-in: Tax Reform as Extended Phenotype." Zenodo. https://doi.org/10.5281/zenodo.14538012.</w:t>
+        <w:t xml:space="preserve">Lerer, I.A. (2025a). "Argentina's Fiscal Lock-in: Tax Reform as Extended Phenotype." SSRN Electronic Journal. https://doi.org/10.2139/ssrn.5635152</w:t>
       </w:r>
     </w:p>
     <w:p>
@@ -34223,7 +34223,7 @@
           <w:sz w:val="24"/>
           <w:szCs w:val="24"/>
         </w:rPr>
-        <w:t xml:space="preserve">Lerer, I.A. (2025b). "Climbing Mount Improbable: A Viable Path for Argentina's Fiscal Reform through IMF-Backed Gradual Transition." Zenodo. https://doi.org/10.5281/zenodo.14538013.</w:t>
+        <w:t xml:space="preserve">Lerer, I.A. (2025b). "Climbing Mount Improbable: A Viable Path for Argentina's Fiscal Reform through IMF-Backed Gradual Transition." SSRN Electronic Journal. https://doi.org/10.2139/ssrn.5645070</w:t>
       </w:r>
     </w:p>
     <w:p>

</xml_diff>